<commit_message>
CV: Digital Creativity 특집호 워킹페이퍼 추가
"Holding the Villain Together: Curated Structure as Authoring
Infrastructure for Interactive Characters" 항목을 Working Papers
섹션에 추가. 초록 억셉 후 본문 제출 준비중, 교신저자.

Co-Authored-By: Claude Opus 5 (1M context) <noreply@anthropic.com>
</commit_message>
<xml_diff>
--- a/files/ByungjunKim_CV_2608.docx
+++ b/files/ByungjunKim_CV_2608.docx
@@ -6298,6 +6298,47 @@
           <w:szCs w:val="20"/>
         </w:rPr>
         <w:t xml:space="preserve"> (Scopus). Co-corresponding author.</w:t>
+      </w:r>
+    </w:p>
+    <w:p>
+      <w:pPr>
+        <w:pStyle w:val="a4"/>
+        <w:numPr>
+          <w:ilvl w:val="0"/>
+          <w:numId w:val="2"/>
+        </w:numPr>
+        <w:spacing w:after="60"/>
+        <w:rPr>
+          <w:rFonts w:ascii="Pretendard" w:eastAsia="Pretendard" w:hAnsi="Pretendard"/>
+          <w:sz w:val="20"/>
+          <w:szCs w:val="20"/>
+        </w:rPr>
+      </w:pPr>
+      <w:r>
+        <w:rPr>
+          <w:rFonts w:ascii="Pretendard" w:eastAsia="Pretendard" w:hAnsi="Pretendard"/>
+          <w:sz w:val="20"/>
+          <w:szCs w:val="20"/>
+        </w:rPr>
+        <w:t xml:space="preserve">“Holding the Villain Together: Curated Structure as Authoring Infrastructure for Interactive Characters.” Abstract accepted for a special issue of </w:t>
+      </w:r>
+      <w:r>
+        <w:rPr>
+          <w:rFonts w:ascii="Pretendard" w:eastAsia="Pretendard" w:hAnsi="Pretendard"/>
+          <w:i/>
+          <w:iCs/>
+          <w:sz w:val="20"/>
+          <w:szCs w:val="20"/>
+        </w:rPr>
+        <w:t xml:space="preserve">Digital Creativity</w:t>
+      </w:r>
+      <w:r>
+        <w:rPr>
+          <w:rFonts w:ascii="Pretendard" w:eastAsia="Pretendard" w:hAnsi="Pretendard"/>
+          <w:sz w:val="20"/>
+          <w:szCs w:val="20"/>
+        </w:rPr>
+        <w:t xml:space="preserve"> (A&amp;HCI); full manuscript in preparation for submission. Corresponding author.</w:t>
       </w:r>
     </w:p>
     <w:p>

</xml_diff>

<commit_message>
CV: Center for Digital Humanities 소속 표기 수정 및 PDF 재생성
Co-Authored-By: Claude Opus 5 (1M context) <noreply@anthropic.com>
Claude-Session: https://claude.ai/code/session_01MrbdrpNQiiZZwG6mT3DCDf
</commit_message>
<xml_diff>
--- a/files/ByungjunKim_CV_2608.docx
+++ b/files/ByungjunKim_CV_2608.docx
@@ -626,7 +626,7 @@
           <w:sz w:val="20"/>
           <w:szCs w:val="20"/>
         </w:rPr>
-        <w:t>, Center for Digital Humanities (</w:t>
+        <w:t xml:space="preserve">, </w:t>
       </w:r>
       <w:hyperlink r:id="rId11" w:history="1">
         <w:r>
@@ -636,7 +636,7 @@
             <w:sz w:val="20"/>
             <w:szCs w:val="20"/>
           </w:rPr>
-          <w:t>digitalhumanities.kr</w:t>
+          <w:t>Center for Digital Humanities</w:t>
         </w:r>
       </w:hyperlink>
       <w:r>
@@ -645,7 +645,7 @@
           <w:sz w:val="20"/>
           <w:szCs w:val="20"/>
         </w:rPr>
-        <w:t>)</w:t>
+        <w:t>, The Academy of Korean Studies</w:t>
       </w:r>
     </w:p>
     <w:p>
@@ -837,7 +837,26 @@
           <w:sz w:val="20"/>
           <w:szCs w:val="20"/>
         </w:rPr>
-        <w:t>, Data Science &amp; Social Analytics Lab (DSSAL), Sungkyunkwan University</w:t>
+        <w:t xml:space="preserve">, </w:t>
+      </w:r>
+      <w:hyperlink r:id="rId12" w:history="1">
+        <w:r>
+          <w:rPr>
+            <w:rStyle w:val="a5"/>
+            <w:rFonts w:ascii="Pretendard" w:eastAsia="Pretendard" w:hAnsi="Pretendard"/>
+            <w:sz w:val="20"/>
+            <w:szCs w:val="20"/>
+          </w:rPr>
+          <w:t>Data Science &amp; Social Analytics Lab (DSSAL)</w:t>
+        </w:r>
+      </w:hyperlink>
+      <w:r>
+        <w:rPr>
+          <w:rFonts w:ascii="Pretendard" w:eastAsia="Pretendard" w:hAnsi="Pretendard"/>
+          <w:sz w:val="20"/>
+          <w:szCs w:val="20"/>
+        </w:rPr>
+        <w:t>, Sungkyunkwan University</w:t>
       </w:r>
     </w:p>
     <w:p>
@@ -1018,7 +1037,7 @@
         </w:rPr>
         <w:t xml:space="preserve">, 12, 102. </w:t>
       </w:r>
-      <w:hyperlink r:id="rId12" w:history="1">
+      <w:hyperlink r:id="rId13" w:history="1">
         <w:r>
           <w:rPr>
             <w:rStyle w:val="a5"/>
@@ -1107,7 +1126,7 @@
         </w:rPr>
         <w:t xml:space="preserve">, 29(1), 161–206. </w:t>
       </w:r>
-      <w:hyperlink r:id="rId13" w:history="1">
+      <w:hyperlink r:id="rId14" w:history="1">
         <w:r>
           <w:rPr>
             <w:rStyle w:val="a5"/>
@@ -1218,7 +1237,7 @@
         </w:rPr>
         <w:t xml:space="preserve"> </w:t>
       </w:r>
-      <w:hyperlink r:id="rId14" w:history="1">
+      <w:hyperlink r:id="rId15" w:history="1">
         <w:r>
           <w:rPr>
             <w:rStyle w:val="a5"/>
@@ -1288,7 +1307,7 @@
         </w:rPr>
         <w:t xml:space="preserve">, 12(1), 1841. </w:t>
       </w:r>
-      <w:hyperlink r:id="rId15" w:history="1">
+      <w:hyperlink r:id="rId16" w:history="1">
         <w:r>
           <w:rPr>
             <w:rStyle w:val="a5"/>
@@ -1358,7 +1377,7 @@
         </w:rPr>
         <w:t xml:space="preserve">, 10, 36. </w:t>
       </w:r>
-      <w:hyperlink r:id="rId16" w:history="1">
+      <w:hyperlink r:id="rId17" w:history="1">
         <w:r>
           <w:rPr>
             <w:rStyle w:val="a5"/>
@@ -1456,7 +1475,7 @@
         </w:rPr>
         <w:t xml:space="preserve">, 34(4), 399-418. </w:t>
       </w:r>
-      <w:hyperlink r:id="rId17" w:history="1">
+      <w:hyperlink r:id="rId18" w:history="1">
         <w:r>
           <w:rPr>
             <w:rStyle w:val="a5"/>
@@ -1518,7 +1537,7 @@
         </w:rPr>
         <w:t xml:space="preserve">, 187, 114020. </w:t>
       </w:r>
-      <w:hyperlink r:id="rId18" w:history="1">
+      <w:hyperlink r:id="rId19" w:history="1">
         <w:r>
           <w:rPr>
             <w:rStyle w:val="a5"/>
@@ -1588,7 +1607,7 @@
         </w:rPr>
         <w:t xml:space="preserve">, 66(9), 3399-3412. </w:t>
       </w:r>
-      <w:hyperlink r:id="rId19" w:history="1">
+      <w:hyperlink r:id="rId20" w:history="1">
         <w:r>
           <w:rPr>
             <w:rStyle w:val="a5"/>
@@ -1658,7 +1677,7 @@
         </w:rPr>
         <w:t xml:space="preserve">, 19(3), orad011. </w:t>
       </w:r>
-      <w:hyperlink r:id="rId20" w:history="1">
+      <w:hyperlink r:id="rId21" w:history="1">
         <w:r>
           <w:rPr>
             <w:rStyle w:val="a5"/>
@@ -1729,7 +1748,7 @@
         </w:rPr>
         <w:t xml:space="preserve">, 31(3), 581–603. </w:t>
       </w:r>
-      <w:hyperlink r:id="rId21" w:history="1">
+      <w:hyperlink r:id="rId22" w:history="1">
         <w:r>
           <w:rPr>
             <w:rStyle w:val="a5"/>
@@ -1799,7 +1818,7 @@
         </w:rPr>
         <w:t xml:space="preserve">, 18(12), 6432. </w:t>
       </w:r>
-      <w:hyperlink r:id="rId22" w:history="1">
+      <w:hyperlink r:id="rId23" w:history="1">
         <w:r>
           <w:rPr>
             <w:rStyle w:val="a5"/>
@@ -1879,7 +1898,7 @@
         </w:rPr>
         <w:t xml:space="preserve">, 108, 102941. </w:t>
       </w:r>
-      <w:hyperlink r:id="rId23" w:history="1">
+      <w:hyperlink r:id="rId24" w:history="1">
         <w:r>
           <w:rPr>
             <w:rStyle w:val="a5"/>
@@ -2080,7 +2099,7 @@
         </w:rPr>
         <w:t xml:space="preserve">: A multilingual coreference dataset of fiction. Proceedings of the 64th Annual Meeting of the Association for Computational Linguistics (Volume 2: Short Papers), 472–480. </w:t>
       </w:r>
-      <w:hyperlink r:id="rId24" w:history="1">
+      <w:hyperlink r:id="rId25" w:history="1">
         <w:r>
           <w:rPr>
             <w:rStyle w:val="a5"/>
@@ -2182,7 +2201,7 @@
         </w:rPr>
         <w:t xml:space="preserve">, 30(1): 1–24, 2026. </w:t>
       </w:r>
-      <w:hyperlink r:id="rId25" w:history="1">
+      <w:hyperlink r:id="rId26" w:history="1">
         <w:r>
           <w:rPr>
             <w:rStyle w:val="a5"/>
@@ -2280,7 +2299,7 @@
         </w:rPr>
         <w:t xml:space="preserve">, 100, 2025. </w:t>
       </w:r>
-      <w:hyperlink r:id="rId26" w:history="1">
+      <w:hyperlink r:id="rId27" w:history="1">
         <w:r>
           <w:rPr>
             <w:rStyle w:val="a5"/>
@@ -2362,7 +2381,7 @@
         </w:rPr>
         <w:t xml:space="preserve">, 59, 2025. </w:t>
       </w:r>
-      <w:hyperlink r:id="rId27" w:history="1">
+      <w:hyperlink r:id="rId28" w:history="1">
         <w:r>
           <w:rPr>
             <w:rStyle w:val="a5"/>
@@ -2558,94 +2577,6 @@
         </w:rPr>
         <w:t xml:space="preserve">, 34, 2024. </w:t>
       </w:r>
-      <w:hyperlink r:id="rId28" w:history="1">
-        <w:r>
-          <w:rPr>
-            <w:rStyle w:val="a5"/>
-            <w:rFonts w:ascii="Pretendard" w:eastAsia="Pretendard" w:hAnsi="Pretendard"/>
-            <w:sz w:val="20"/>
-            <w:szCs w:val="20"/>
-          </w:rPr>
-          <w:t>doi.org/10.15797/concom.2024..34.004</w:t>
-        </w:r>
-      </w:hyperlink>
-    </w:p>
-    <w:p>
-      <w:pPr>
-        <w:pStyle w:val="a4"/>
-        <w:numPr>
-          <w:ilvl w:val="0"/>
-          <w:numId w:val="5"/>
-        </w:numPr>
-        <w:spacing w:after="70"/>
-        <w:rPr>
-          <w:rFonts w:ascii="Pretendard" w:eastAsia="Pretendard" w:hAnsi="Pretendard"/>
-          <w:sz w:val="20"/>
-          <w:szCs w:val="20"/>
-        </w:rPr>
-      </w:pPr>
-      <w:r>
-        <w:rPr>
-          <w:rFonts w:ascii="Pretendard" w:eastAsia="Pretendard" w:hAnsi="Pretendard"/>
-          <w:sz w:val="20"/>
-          <w:szCs w:val="20"/>
-        </w:rPr>
-        <w:t xml:space="preserve">서재현, 하나, 김민우, 한지민, </w:t>
-      </w:r>
-      <w:r>
-        <w:rPr>
-          <w:rFonts w:ascii="Pretendard" w:eastAsia="Pretendard" w:hAnsi="Pretendard"/>
-          <w:b/>
-          <w:bCs/>
-          <w:sz w:val="20"/>
-          <w:szCs w:val="20"/>
-        </w:rPr>
-        <w:t>김병준</w:t>
-      </w:r>
-      <w:r>
-        <w:rPr>
-          <w:rFonts w:ascii="Pretendard" w:eastAsia="Pretendard" w:hAnsi="Pretendard"/>
-          <w:sz w:val="20"/>
-          <w:szCs w:val="20"/>
-        </w:rPr>
-        <w:t xml:space="preserve">, </w:t>
-      </w:r>
-      <w:proofErr w:type="spellStart"/>
-      <w:r>
-        <w:rPr>
-          <w:rFonts w:ascii="Pretendard" w:eastAsia="Pretendard" w:hAnsi="Pretendard"/>
-          <w:sz w:val="20"/>
-          <w:szCs w:val="20"/>
-        </w:rPr>
-        <w:t>박소정</w:t>
-      </w:r>
-      <w:proofErr w:type="spellEnd"/>
-      <w:r>
-        <w:rPr>
-          <w:rFonts w:ascii="Pretendard" w:eastAsia="Pretendard" w:hAnsi="Pretendard"/>
-          <w:sz w:val="20"/>
-          <w:szCs w:val="20"/>
-        </w:rPr>
-        <w:t xml:space="preserve">. 「멀리서 읽는 “저희” — ELECTRA 기반 의미 분류 모델과 N-gram을 활용한 두 가지 ‘저희’의 통시적 변화 양상 연구」. </w:t>
-      </w:r>
-      <w:r>
-        <w:rPr>
-          <w:rFonts w:ascii="Pretendard" w:eastAsia="Pretendard" w:hAnsi="Pretendard"/>
-          <w:i/>
-          <w:iCs/>
-          <w:sz w:val="20"/>
-          <w:szCs w:val="20"/>
-        </w:rPr>
-        <w:t>대동문화연구</w:t>
-      </w:r>
-      <w:r>
-        <w:rPr>
-          <w:rFonts w:ascii="Pretendard" w:eastAsia="Pretendard" w:hAnsi="Pretendard"/>
-          <w:sz w:val="20"/>
-          <w:szCs w:val="20"/>
-        </w:rPr>
-        <w:t xml:space="preserve">, 128, 2024. </w:t>
-      </w:r>
       <w:hyperlink r:id="rId29" w:history="1">
         <w:r>
           <w:rPr>
@@ -2654,7 +2585,27 @@
             <w:sz w:val="20"/>
             <w:szCs w:val="20"/>
           </w:rPr>
-          <w:t>doi.org/10.18219/ddmh..128.202412.513</w:t>
+          <w:t>doi.org/10.15797/</w:t>
+        </w:r>
+        <w:proofErr w:type="gramStart"/>
+        <w:r>
+          <w:rPr>
+            <w:rStyle w:val="a5"/>
+            <w:rFonts w:ascii="Pretendard" w:eastAsia="Pretendard" w:hAnsi="Pretendard"/>
+            <w:sz w:val="20"/>
+            <w:szCs w:val="20"/>
+          </w:rPr>
+          <w:t>concom.2024..</w:t>
+        </w:r>
+        <w:proofErr w:type="gramEnd"/>
+        <w:r>
+          <w:rPr>
+            <w:rStyle w:val="a5"/>
+            <w:rFonts w:ascii="Pretendard" w:eastAsia="Pretendard" w:hAnsi="Pretendard"/>
+            <w:sz w:val="20"/>
+            <w:szCs w:val="20"/>
+          </w:rPr>
+          <w:t>34.004</w:t>
         </w:r>
       </w:hyperlink>
     </w:p>
@@ -2678,34 +2629,15 @@
           <w:sz w:val="20"/>
           <w:szCs w:val="20"/>
         </w:rPr>
-        <w:t xml:space="preserve">(KCI </w:t>
-      </w:r>
-      <w:proofErr w:type="spellStart"/>
-      <w:r>
-        <w:rPr>
-          <w:rFonts w:ascii="Pretendard" w:eastAsia="Pretendard" w:hAnsi="Pretendard"/>
-          <w:sz w:val="20"/>
-          <w:szCs w:val="20"/>
-        </w:rPr>
-        <w:t>미등재</w:t>
-      </w:r>
-      <w:proofErr w:type="spellEnd"/>
-      <w:r>
-        <w:rPr>
-          <w:rFonts w:ascii="Pretendard" w:eastAsia="Pretendard" w:hAnsi="Pretendard"/>
-          <w:sz w:val="20"/>
-          <w:szCs w:val="20"/>
-        </w:rPr>
-        <w:t xml:space="preserve">) </w:t>
-      </w:r>
-      <w:r>
-        <w:rPr>
-          <w:rFonts w:ascii="Pretendard" w:eastAsia="Pretendard" w:hAnsi="Pretendard"/>
-          <w:b/>
-          <w:bCs/>
-          <w:sz w:val="20"/>
-          <w:szCs w:val="20"/>
-          <w:u w:val="single"/>
+        <w:t xml:space="preserve">서재현, 하나, 김민우, 한지민, </w:t>
+      </w:r>
+      <w:r>
+        <w:rPr>
+          <w:rFonts w:ascii="Pretendard" w:eastAsia="Pretendard" w:hAnsi="Pretendard"/>
+          <w:b/>
+          <w:bCs/>
+          <w:sz w:val="20"/>
+          <w:szCs w:val="20"/>
         </w:rPr>
         <w:t>김병준</w:t>
       </w:r>
@@ -2715,43 +2647,25 @@
           <w:sz w:val="20"/>
           <w:szCs w:val="20"/>
         </w:rPr>
-        <w:t xml:space="preserve">. 「근대 </w:t>
-      </w:r>
-      <w:proofErr w:type="spellStart"/>
-      <w:r>
-        <w:rPr>
-          <w:rFonts w:ascii="Pretendard" w:eastAsia="Pretendard" w:hAnsi="Pretendard"/>
-          <w:sz w:val="20"/>
-          <w:szCs w:val="20"/>
-        </w:rPr>
-        <w:t>국한문혼용체</w:t>
-      </w:r>
-      <w:proofErr w:type="spellEnd"/>
-      <w:r>
-        <w:rPr>
-          <w:rFonts w:ascii="Pretendard" w:eastAsia="Pretendard" w:hAnsi="Pretendard"/>
-          <w:sz w:val="20"/>
-          <w:szCs w:val="20"/>
-        </w:rPr>
-        <w:t xml:space="preserve"> 자료 </w:t>
-      </w:r>
-      <w:proofErr w:type="spellStart"/>
-      <w:r>
-        <w:rPr>
-          <w:rFonts w:ascii="Pretendard" w:eastAsia="Pretendard" w:hAnsi="Pretendard"/>
-          <w:sz w:val="20"/>
-          <w:szCs w:val="20"/>
-        </w:rPr>
-        <w:t>서브워드</w:t>
-      </w:r>
-      <w:proofErr w:type="spellEnd"/>
-      <w:r>
-        <w:rPr>
-          <w:rFonts w:ascii="Pretendard" w:eastAsia="Pretendard" w:hAnsi="Pretendard"/>
-          <w:sz w:val="20"/>
-          <w:szCs w:val="20"/>
-        </w:rPr>
-        <w:t xml:space="preserve"> 기반 형태소 분석기의 설계와 적용」. </w:t>
+        <w:t xml:space="preserve">, </w:t>
+      </w:r>
+      <w:proofErr w:type="spellStart"/>
+      <w:r>
+        <w:rPr>
+          <w:rFonts w:ascii="Pretendard" w:eastAsia="Pretendard" w:hAnsi="Pretendard"/>
+          <w:sz w:val="20"/>
+          <w:szCs w:val="20"/>
+        </w:rPr>
+        <w:t>박소정</w:t>
+      </w:r>
+      <w:proofErr w:type="spellEnd"/>
+      <w:r>
+        <w:rPr>
+          <w:rFonts w:ascii="Pretendard" w:eastAsia="Pretendard" w:hAnsi="Pretendard"/>
+          <w:sz w:val="20"/>
+          <w:szCs w:val="20"/>
+        </w:rPr>
+        <w:t xml:space="preserve">. 「멀리서 읽는 “저희” — ELECTRA 기반 의미 분류 모델과 N-gram을 활용한 두 가지 ‘저희’의 통시적 변화 양상 연구」. </w:t>
       </w:r>
       <w:r>
         <w:rPr>
@@ -2761,6 +2675,151 @@
           <w:sz w:val="20"/>
           <w:szCs w:val="20"/>
         </w:rPr>
+        <w:t>대동문화연구</w:t>
+      </w:r>
+      <w:r>
+        <w:rPr>
+          <w:rFonts w:ascii="Pretendard" w:eastAsia="Pretendard" w:hAnsi="Pretendard"/>
+          <w:sz w:val="20"/>
+          <w:szCs w:val="20"/>
+        </w:rPr>
+        <w:t xml:space="preserve">, 128, 2024. </w:t>
+      </w:r>
+      <w:hyperlink r:id="rId30" w:history="1">
+        <w:r>
+          <w:rPr>
+            <w:rStyle w:val="a5"/>
+            <w:rFonts w:ascii="Pretendard" w:eastAsia="Pretendard" w:hAnsi="Pretendard"/>
+            <w:sz w:val="20"/>
+            <w:szCs w:val="20"/>
+          </w:rPr>
+          <w:t>doi.org/10.18219/</w:t>
+        </w:r>
+        <w:proofErr w:type="gramStart"/>
+        <w:r>
+          <w:rPr>
+            <w:rStyle w:val="a5"/>
+            <w:rFonts w:ascii="Pretendard" w:eastAsia="Pretendard" w:hAnsi="Pretendard"/>
+            <w:sz w:val="20"/>
+            <w:szCs w:val="20"/>
+          </w:rPr>
+          <w:t>ddmh..</w:t>
+        </w:r>
+        <w:proofErr w:type="gramEnd"/>
+        <w:r>
+          <w:rPr>
+            <w:rStyle w:val="a5"/>
+            <w:rFonts w:ascii="Pretendard" w:eastAsia="Pretendard" w:hAnsi="Pretendard"/>
+            <w:sz w:val="20"/>
+            <w:szCs w:val="20"/>
+          </w:rPr>
+          <w:t>128.202412.513</w:t>
+        </w:r>
+      </w:hyperlink>
+    </w:p>
+    <w:p>
+      <w:pPr>
+        <w:pStyle w:val="a4"/>
+        <w:numPr>
+          <w:ilvl w:val="0"/>
+          <w:numId w:val="5"/>
+        </w:numPr>
+        <w:spacing w:after="70"/>
+        <w:rPr>
+          <w:rFonts w:ascii="Pretendard" w:eastAsia="Pretendard" w:hAnsi="Pretendard"/>
+          <w:sz w:val="20"/>
+          <w:szCs w:val="20"/>
+        </w:rPr>
+      </w:pPr>
+      <w:r>
+        <w:rPr>
+          <w:rFonts w:ascii="Pretendard" w:eastAsia="Pretendard" w:hAnsi="Pretendard"/>
+          <w:sz w:val="20"/>
+          <w:szCs w:val="20"/>
+        </w:rPr>
+        <w:t xml:space="preserve">(KCI </w:t>
+      </w:r>
+      <w:proofErr w:type="spellStart"/>
+      <w:r>
+        <w:rPr>
+          <w:rFonts w:ascii="Pretendard" w:eastAsia="Pretendard" w:hAnsi="Pretendard"/>
+          <w:sz w:val="20"/>
+          <w:szCs w:val="20"/>
+        </w:rPr>
+        <w:t>미등재</w:t>
+      </w:r>
+      <w:proofErr w:type="spellEnd"/>
+      <w:r>
+        <w:rPr>
+          <w:rFonts w:ascii="Pretendard" w:eastAsia="Pretendard" w:hAnsi="Pretendard"/>
+          <w:sz w:val="20"/>
+          <w:szCs w:val="20"/>
+        </w:rPr>
+        <w:t xml:space="preserve">) </w:t>
+      </w:r>
+      <w:r>
+        <w:rPr>
+          <w:rFonts w:ascii="Pretendard" w:eastAsia="Pretendard" w:hAnsi="Pretendard"/>
+          <w:b/>
+          <w:bCs/>
+          <w:sz w:val="20"/>
+          <w:szCs w:val="20"/>
+          <w:u w:val="single"/>
+        </w:rPr>
+        <w:t>김병준</w:t>
+      </w:r>
+      <w:r>
+        <w:rPr>
+          <w:rFonts w:ascii="Pretendard" w:eastAsia="Pretendard" w:hAnsi="Pretendard"/>
+          <w:sz w:val="20"/>
+          <w:szCs w:val="20"/>
+        </w:rPr>
+        <w:t xml:space="preserve">. 「근대 </w:t>
+      </w:r>
+      <w:proofErr w:type="spellStart"/>
+      <w:r>
+        <w:rPr>
+          <w:rFonts w:ascii="Pretendard" w:eastAsia="Pretendard" w:hAnsi="Pretendard"/>
+          <w:sz w:val="20"/>
+          <w:szCs w:val="20"/>
+        </w:rPr>
+        <w:t>국한문혼용체</w:t>
+      </w:r>
+      <w:proofErr w:type="spellEnd"/>
+      <w:r>
+        <w:rPr>
+          <w:rFonts w:ascii="Pretendard" w:eastAsia="Pretendard" w:hAnsi="Pretendard"/>
+          <w:sz w:val="20"/>
+          <w:szCs w:val="20"/>
+        </w:rPr>
+        <w:t xml:space="preserve"> 자료 </w:t>
+      </w:r>
+      <w:proofErr w:type="spellStart"/>
+      <w:r>
+        <w:rPr>
+          <w:rFonts w:ascii="Pretendard" w:eastAsia="Pretendard" w:hAnsi="Pretendard"/>
+          <w:sz w:val="20"/>
+          <w:szCs w:val="20"/>
+        </w:rPr>
+        <w:t>서브워드</w:t>
+      </w:r>
+      <w:proofErr w:type="spellEnd"/>
+      <w:r>
+        <w:rPr>
+          <w:rFonts w:ascii="Pretendard" w:eastAsia="Pretendard" w:hAnsi="Pretendard"/>
+          <w:sz w:val="20"/>
+          <w:szCs w:val="20"/>
+        </w:rPr>
+        <w:t xml:space="preserve"> 기반 형태소 분석기의 설계와 적용」. </w:t>
+      </w:r>
+      <w:r>
+        <w:rPr>
+          <w:rFonts w:ascii="Pretendard" w:eastAsia="Pretendard" w:hAnsi="Pretendard"/>
+          <w:i/>
+          <w:iCs/>
+          <w:sz w:val="20"/>
+          <w:szCs w:val="20"/>
+        </w:rPr>
         <w:t>디지털인문학</w:t>
       </w:r>
       <w:r>
@@ -2771,7 +2830,7 @@
         </w:rPr>
         <w:t xml:space="preserve">, 1(2), 2024. </w:t>
       </w:r>
-      <w:hyperlink r:id="rId30" w:history="1">
+      <w:hyperlink r:id="rId31" w:history="1">
         <w:r>
           <w:rPr>
             <w:rStyle w:val="a5"/>
@@ -2915,7 +2974,7 @@
         </w:rPr>
         <w:t xml:space="preserve">, 74, 2024. </w:t>
       </w:r>
-      <w:hyperlink r:id="rId31" w:history="1">
+      <w:hyperlink r:id="rId32" w:history="1">
         <w:r>
           <w:rPr>
             <w:rStyle w:val="a5"/>
@@ -3004,7 +3063,7 @@
         </w:rPr>
         <w:t xml:space="preserve">, 20(3), 2024. </w:t>
       </w:r>
-      <w:hyperlink r:id="rId32" w:history="1">
+      <w:hyperlink r:id="rId33" w:history="1">
         <w:r>
           <w:rPr>
             <w:rStyle w:val="a5"/>
@@ -3131,7 +3190,7 @@
         </w:rPr>
         <w:t xml:space="preserve">, 2024. </w:t>
       </w:r>
-      <w:hyperlink r:id="rId33" w:history="1">
+      <w:hyperlink r:id="rId34" w:history="1">
         <w:r>
           <w:rPr>
             <w:rStyle w:val="a5"/>
@@ -3265,7 +3324,7 @@
         </w:rPr>
         <w:t xml:space="preserve">, 46, 2023. </w:t>
       </w:r>
-      <w:hyperlink r:id="rId34" w:history="1">
+      <w:hyperlink r:id="rId35" w:history="1">
         <w:r>
           <w:rPr>
             <w:rStyle w:val="a5"/>
@@ -3363,7 +3422,7 @@
         </w:rPr>
         <w:t xml:space="preserve">, 90, 2023. </w:t>
       </w:r>
-      <w:hyperlink r:id="rId35" w:history="1">
+      <w:hyperlink r:id="rId36" w:history="1">
         <w:r>
           <w:rPr>
             <w:rStyle w:val="a5"/>
@@ -3451,7 +3510,7 @@
         </w:rPr>
         <w:t xml:space="preserve">, 57(2): 131–157, 2023. </w:t>
       </w:r>
-      <w:hyperlink r:id="rId36" w:history="1">
+      <w:hyperlink r:id="rId37" w:history="1">
         <w:r>
           <w:rPr>
             <w:rStyle w:val="a5"/>
@@ -3593,7 +3652,7 @@
         </w:rPr>
         <w:t xml:space="preserve">, 96, 2023. </w:t>
       </w:r>
-      <w:hyperlink r:id="rId37" w:history="1">
+      <w:hyperlink r:id="rId38" w:history="1">
         <w:r>
           <w:rPr>
             <w:rStyle w:val="a5"/>
@@ -3663,7 +3722,7 @@
         </w:rPr>
         <w:t xml:space="preserve">, 11(2), 202–226. </w:t>
       </w:r>
-      <w:hyperlink r:id="rId38" w:history="1">
+      <w:hyperlink r:id="rId39" w:history="1">
         <w:r>
           <w:rPr>
             <w:rStyle w:val="a5"/>
@@ -3751,71 +3810,6 @@
         </w:rPr>
         <w:t xml:space="preserve">, 115, 2021. </w:t>
       </w:r>
-      <w:hyperlink r:id="rId39" w:history="1">
-        <w:r>
-          <w:rPr>
-            <w:rStyle w:val="a5"/>
-            <w:rFonts w:ascii="Pretendard" w:eastAsia="Pretendard" w:hAnsi="Pretendard"/>
-            <w:sz w:val="20"/>
-            <w:szCs w:val="20"/>
-          </w:rPr>
-          <w:t>doi.org/10.18219/ddmh..115.202109.349</w:t>
-        </w:r>
-      </w:hyperlink>
-    </w:p>
-    <w:p>
-      <w:pPr>
-        <w:pStyle w:val="a4"/>
-        <w:numPr>
-          <w:ilvl w:val="0"/>
-          <w:numId w:val="5"/>
-        </w:numPr>
-        <w:spacing w:after="70"/>
-        <w:rPr>
-          <w:rFonts w:ascii="Pretendard" w:eastAsia="Pretendard" w:hAnsi="Pretendard"/>
-          <w:sz w:val="20"/>
-          <w:szCs w:val="20"/>
-        </w:rPr>
-      </w:pPr>
-      <w:r>
-        <w:rPr>
-          <w:rFonts w:ascii="Pretendard" w:eastAsia="Pretendard" w:hAnsi="Pretendard"/>
-          <w:b/>
-          <w:bCs/>
-          <w:sz w:val="20"/>
-          <w:szCs w:val="20"/>
-        </w:rPr>
-        <w:lastRenderedPageBreak/>
-        <w:t>김병준</w:t>
-      </w:r>
-      <w:r>
-        <w:rPr>
-          <w:rFonts w:ascii="Pretendard" w:eastAsia="Pretendard" w:hAnsi="Pretendard"/>
-          <w:sz w:val="20"/>
-          <w:szCs w:val="20"/>
-        </w:rPr>
-        <w:t xml:space="preserve">, 천정환. 「박사학위 논문(2000~2019) 데이터 분석을 통해 본 한국 현대문학 연구의 변화와 전망」. </w:t>
-      </w:r>
-      <w:proofErr w:type="spellStart"/>
-      <w:r>
-        <w:rPr>
-          <w:rFonts w:ascii="Pretendard" w:eastAsia="Pretendard" w:hAnsi="Pretendard"/>
-          <w:i/>
-          <w:iCs/>
-          <w:sz w:val="20"/>
-          <w:szCs w:val="20"/>
-        </w:rPr>
-        <w:t>상허학보</w:t>
-      </w:r>
-      <w:proofErr w:type="spellEnd"/>
-      <w:r>
-        <w:rPr>
-          <w:rFonts w:ascii="Pretendard" w:eastAsia="Pretendard" w:hAnsi="Pretendard"/>
-          <w:sz w:val="20"/>
-          <w:szCs w:val="20"/>
-        </w:rPr>
-        <w:t xml:space="preserve">, 60, 2020. </w:t>
-      </w:r>
       <w:hyperlink r:id="rId40" w:history="1">
         <w:r>
           <w:rPr>
@@ -3824,7 +3818,27 @@
             <w:sz w:val="20"/>
             <w:szCs w:val="20"/>
           </w:rPr>
-          <w:t>doi.org/10.22936/sh.60..202010.012</w:t>
+          <w:t>doi.org/10.18219/</w:t>
+        </w:r>
+        <w:proofErr w:type="gramStart"/>
+        <w:r>
+          <w:rPr>
+            <w:rStyle w:val="a5"/>
+            <w:rFonts w:ascii="Pretendard" w:eastAsia="Pretendard" w:hAnsi="Pretendard"/>
+            <w:sz w:val="20"/>
+            <w:szCs w:val="20"/>
+          </w:rPr>
+          <w:t>ddmh..</w:t>
+        </w:r>
+        <w:proofErr w:type="gramEnd"/>
+        <w:r>
+          <w:rPr>
+            <w:rStyle w:val="a5"/>
+            <w:rFonts w:ascii="Pretendard" w:eastAsia="Pretendard" w:hAnsi="Pretendard"/>
+            <w:sz w:val="20"/>
+            <w:szCs w:val="20"/>
+          </w:rPr>
+          <w:t>115.202109.349</w:t>
         </w:r>
       </w:hyperlink>
     </w:p>
@@ -3842,33 +3856,15 @@
           <w:szCs w:val="20"/>
         </w:rPr>
       </w:pPr>
-      <w:proofErr w:type="spellStart"/>
-      <w:r>
-        <w:rPr>
-          <w:rFonts w:ascii="Pretendard" w:eastAsia="Pretendard" w:hAnsi="Pretendard"/>
-          <w:sz w:val="20"/>
-          <w:szCs w:val="20"/>
-        </w:rPr>
-        <w:t>전성규</w:t>
-      </w:r>
-      <w:proofErr w:type="spellEnd"/>
-      <w:r>
-        <w:rPr>
-          <w:rFonts w:ascii="Pretendard" w:eastAsia="Pretendard" w:hAnsi="Pretendard"/>
-          <w:sz w:val="20"/>
-          <w:szCs w:val="20"/>
-        </w:rPr>
-        <w:t xml:space="preserve">, </w:t>
-      </w:r>
-      <w:r>
-        <w:rPr>
-          <w:rFonts w:ascii="Pretendard" w:eastAsia="Pretendard" w:hAnsi="Pretendard"/>
-          <w:b/>
-          <w:bCs/>
-          <w:sz w:val="20"/>
-          <w:szCs w:val="20"/>
-          <w:u w:val="single"/>
-        </w:rPr>
+      <w:r>
+        <w:rPr>
+          <w:rFonts w:ascii="Pretendard" w:eastAsia="Pretendard" w:hAnsi="Pretendard"/>
+          <w:b/>
+          <w:bCs/>
+          <w:sz w:val="20"/>
+          <w:szCs w:val="20"/>
+        </w:rPr>
+        <w:lastRenderedPageBreak/>
         <w:t>김병준</w:t>
       </w:r>
       <w:r>
@@ -3877,44 +3873,9 @@
           <w:sz w:val="20"/>
           <w:szCs w:val="20"/>
         </w:rPr>
-        <w:t>. 「디지털인문학 방법론을 통한 『</w:t>
-      </w:r>
-      <w:proofErr w:type="spellStart"/>
-      <w:r>
-        <w:rPr>
-          <w:rFonts w:ascii="Pretendard" w:eastAsia="Pretendard" w:hAnsi="Pretendard"/>
-          <w:sz w:val="20"/>
-          <w:szCs w:val="20"/>
-        </w:rPr>
-        <w:t>서북학회월보』와</w:t>
-      </w:r>
-      <w:proofErr w:type="spellEnd"/>
-      <w:r>
-        <w:rPr>
-          <w:rFonts w:ascii="Pretendard" w:eastAsia="Pretendard" w:hAnsi="Pretendard"/>
-          <w:sz w:val="20"/>
-          <w:szCs w:val="20"/>
-        </w:rPr>
-        <w:t xml:space="preserve"> 『</w:t>
-      </w:r>
-      <w:proofErr w:type="spellStart"/>
-      <w:r>
-        <w:rPr>
-          <w:rFonts w:ascii="Pretendard" w:eastAsia="Pretendard" w:hAnsi="Pretendard"/>
-          <w:sz w:val="20"/>
-          <w:szCs w:val="20"/>
-        </w:rPr>
-        <w:t>태극학보』의</w:t>
-      </w:r>
-      <w:proofErr w:type="spellEnd"/>
-      <w:r>
-        <w:rPr>
-          <w:rFonts w:ascii="Pretendard" w:eastAsia="Pretendard" w:hAnsi="Pretendard"/>
-          <w:sz w:val="20"/>
-          <w:szCs w:val="20"/>
-        </w:rPr>
-        <w:t xml:space="preserve"> 담론적 상관관계 연구」. </w:t>
-      </w:r>
+        <w:t xml:space="preserve">, 천정환. 「박사학위 논문(2000~2019) 데이터 분석을 통해 본 한국 현대문학 연구의 변화와 전망」. </w:t>
+      </w:r>
+      <w:proofErr w:type="spellStart"/>
       <w:r>
         <w:rPr>
           <w:rFonts w:ascii="Pretendard" w:eastAsia="Pretendard" w:hAnsi="Pretendard"/>
@@ -3923,15 +3884,16 @@
           <w:sz w:val="20"/>
           <w:szCs w:val="20"/>
         </w:rPr>
-        <w:t>개념과 소통</w:t>
-      </w:r>
-      <w:r>
-        <w:rPr>
-          <w:rFonts w:ascii="Pretendard" w:eastAsia="Pretendard" w:hAnsi="Pretendard"/>
-          <w:sz w:val="20"/>
-          <w:szCs w:val="20"/>
-        </w:rPr>
-        <w:t xml:space="preserve">, 23, 2019. </w:t>
+        <w:t>상허학보</w:t>
+      </w:r>
+      <w:proofErr w:type="spellEnd"/>
+      <w:r>
+        <w:rPr>
+          <w:rFonts w:ascii="Pretendard" w:eastAsia="Pretendard" w:hAnsi="Pretendard"/>
+          <w:sz w:val="20"/>
+          <w:szCs w:val="20"/>
+        </w:rPr>
+        <w:t xml:space="preserve">, 60, 2020. </w:t>
       </w:r>
       <w:hyperlink r:id="rId41" w:history="1">
         <w:r>
@@ -3941,7 +3903,27 @@
             <w:sz w:val="20"/>
             <w:szCs w:val="20"/>
           </w:rPr>
-          <w:t>doi.org/10.15797/concom.2019..23.005</w:t>
+          <w:t>doi.org/10.22936/sh.</w:t>
+        </w:r>
+        <w:proofErr w:type="gramStart"/>
+        <w:r>
+          <w:rPr>
+            <w:rStyle w:val="a5"/>
+            <w:rFonts w:ascii="Pretendard" w:eastAsia="Pretendard" w:hAnsi="Pretendard"/>
+            <w:sz w:val="20"/>
+            <w:szCs w:val="20"/>
+          </w:rPr>
+          <w:t>60..</w:t>
+        </w:r>
+        <w:proofErr w:type="gramEnd"/>
+        <w:r>
+          <w:rPr>
+            <w:rStyle w:val="a5"/>
+            <w:rFonts w:ascii="Pretendard" w:eastAsia="Pretendard" w:hAnsi="Pretendard"/>
+            <w:sz w:val="20"/>
+            <w:szCs w:val="20"/>
+          </w:rPr>
+          <w:t>202010.012</w:t>
         </w:r>
       </w:hyperlink>
     </w:p>
@@ -3959,13 +3941,32 @@
           <w:szCs w:val="20"/>
         </w:rPr>
       </w:pPr>
-      <w:r>
-        <w:rPr>
-          <w:rFonts w:ascii="Pretendard" w:eastAsia="Pretendard" w:hAnsi="Pretendard"/>
-          <w:b/>
-          <w:bCs/>
-          <w:sz w:val="20"/>
-          <w:szCs w:val="20"/>
+      <w:proofErr w:type="spellStart"/>
+      <w:r>
+        <w:rPr>
+          <w:rFonts w:ascii="Pretendard" w:eastAsia="Pretendard" w:hAnsi="Pretendard"/>
+          <w:sz w:val="20"/>
+          <w:szCs w:val="20"/>
+        </w:rPr>
+        <w:t>전성규</w:t>
+      </w:r>
+      <w:proofErr w:type="spellEnd"/>
+      <w:r>
+        <w:rPr>
+          <w:rFonts w:ascii="Pretendard" w:eastAsia="Pretendard" w:hAnsi="Pretendard"/>
+          <w:sz w:val="20"/>
+          <w:szCs w:val="20"/>
+        </w:rPr>
+        <w:t xml:space="preserve">, </w:t>
+      </w:r>
+      <w:r>
+        <w:rPr>
+          <w:rFonts w:ascii="Pretendard" w:eastAsia="Pretendard" w:hAnsi="Pretendard"/>
+          <w:b/>
+          <w:bCs/>
+          <w:sz w:val="20"/>
+          <w:szCs w:val="20"/>
+          <w:u w:val="single"/>
         </w:rPr>
         <w:t>김병준</w:t>
       </w:r>
@@ -3975,43 +3976,43 @@
           <w:sz w:val="20"/>
           <w:szCs w:val="20"/>
         </w:rPr>
-        <w:t xml:space="preserve">, </w:t>
-      </w:r>
-      <w:proofErr w:type="spellStart"/>
-      <w:r>
-        <w:rPr>
-          <w:rFonts w:ascii="Pretendard" w:eastAsia="Pretendard" w:hAnsi="Pretendard"/>
-          <w:sz w:val="20"/>
-          <w:szCs w:val="20"/>
-        </w:rPr>
-        <w:t>전봉관</w:t>
-      </w:r>
-      <w:proofErr w:type="spellEnd"/>
-      <w:r>
-        <w:rPr>
-          <w:rFonts w:ascii="Pretendard" w:eastAsia="Pretendard" w:hAnsi="Pretendard"/>
-          <w:sz w:val="20"/>
-          <w:szCs w:val="20"/>
-        </w:rPr>
-        <w:t xml:space="preserve">, </w:t>
-      </w:r>
-      <w:proofErr w:type="spellStart"/>
-      <w:r>
-        <w:rPr>
-          <w:rFonts w:ascii="Pretendard" w:eastAsia="Pretendard" w:hAnsi="Pretendard"/>
-          <w:sz w:val="20"/>
-          <w:szCs w:val="20"/>
-        </w:rPr>
-        <w:t>이원재</w:t>
-      </w:r>
-      <w:proofErr w:type="spellEnd"/>
-      <w:r>
-        <w:rPr>
-          <w:rFonts w:ascii="Pretendard" w:eastAsia="Pretendard" w:hAnsi="Pretendard"/>
-          <w:sz w:val="20"/>
-          <w:szCs w:val="20"/>
-        </w:rPr>
-        <w:t xml:space="preserve">. 「비평 언어의 변동: 문예지 비평 텍스트에 나타난 개념단어의 변동 양상, 1995~2015」. </w:t>
+        <w:t>. 「디지털인문학 방법론을 통한 『</w:t>
+      </w:r>
+      <w:proofErr w:type="spellStart"/>
+      <w:r>
+        <w:rPr>
+          <w:rFonts w:ascii="Pretendard" w:eastAsia="Pretendard" w:hAnsi="Pretendard"/>
+          <w:sz w:val="20"/>
+          <w:szCs w:val="20"/>
+        </w:rPr>
+        <w:t>서북학회월보』와</w:t>
+      </w:r>
+      <w:proofErr w:type="spellEnd"/>
+      <w:r>
+        <w:rPr>
+          <w:rFonts w:ascii="Pretendard" w:eastAsia="Pretendard" w:hAnsi="Pretendard"/>
+          <w:sz w:val="20"/>
+          <w:szCs w:val="20"/>
+        </w:rPr>
+        <w:t xml:space="preserve"> 『</w:t>
+      </w:r>
+      <w:proofErr w:type="spellStart"/>
+      <w:r>
+        <w:rPr>
+          <w:rFonts w:ascii="Pretendard" w:eastAsia="Pretendard" w:hAnsi="Pretendard"/>
+          <w:sz w:val="20"/>
+          <w:szCs w:val="20"/>
+        </w:rPr>
+        <w:t>태극학보』의</w:t>
+      </w:r>
+      <w:proofErr w:type="spellEnd"/>
+      <w:r>
+        <w:rPr>
+          <w:rFonts w:ascii="Pretendard" w:eastAsia="Pretendard" w:hAnsi="Pretendard"/>
+          <w:sz w:val="20"/>
+          <w:szCs w:val="20"/>
+        </w:rPr>
+        <w:t xml:space="preserve"> 담론적 상관관계 연구」. </w:t>
       </w:r>
       <w:r>
         <w:rPr>
@@ -4021,15 +4022,15 @@
           <w:sz w:val="20"/>
           <w:szCs w:val="20"/>
         </w:rPr>
-        <w:t>현대문학의 연구</w:t>
-      </w:r>
-      <w:r>
-        <w:rPr>
-          <w:rFonts w:ascii="Pretendard" w:eastAsia="Pretendard" w:hAnsi="Pretendard"/>
-          <w:sz w:val="20"/>
-          <w:szCs w:val="20"/>
-        </w:rPr>
-        <w:t xml:space="preserve">, 61, 2017. </w:t>
+        <w:t>개념과 소통</w:t>
+      </w:r>
+      <w:r>
+        <w:rPr>
+          <w:rFonts w:ascii="Pretendard" w:eastAsia="Pretendard" w:hAnsi="Pretendard"/>
+          <w:sz w:val="20"/>
+          <w:szCs w:val="20"/>
+        </w:rPr>
+        <w:t xml:space="preserve">, 23, 2019. </w:t>
       </w:r>
       <w:hyperlink r:id="rId42" w:history="1">
         <w:r>
@@ -4039,7 +4040,27 @@
             <w:sz w:val="20"/>
             <w:szCs w:val="20"/>
           </w:rPr>
-          <w:t>doi.org/10.35419/kmlit.2017..61.002</w:t>
+          <w:t>doi.org/10.15797/</w:t>
+        </w:r>
+        <w:proofErr w:type="gramStart"/>
+        <w:r>
+          <w:rPr>
+            <w:rStyle w:val="a5"/>
+            <w:rFonts w:ascii="Pretendard" w:eastAsia="Pretendard" w:hAnsi="Pretendard"/>
+            <w:sz w:val="20"/>
+            <w:szCs w:val="20"/>
+          </w:rPr>
+          <w:t>concom.2019..</w:t>
+        </w:r>
+        <w:proofErr w:type="gramEnd"/>
+        <w:r>
+          <w:rPr>
+            <w:rStyle w:val="a5"/>
+            <w:rFonts w:ascii="Pretendard" w:eastAsia="Pretendard" w:hAnsi="Pretendard"/>
+            <w:sz w:val="20"/>
+            <w:szCs w:val="20"/>
+          </w:rPr>
+          <w:t>23.005</w:t>
         </w:r>
       </w:hyperlink>
     </w:p>
@@ -4057,6 +4078,42 @@
           <w:szCs w:val="20"/>
         </w:rPr>
       </w:pPr>
+      <w:r>
+        <w:rPr>
+          <w:rFonts w:ascii="Pretendard" w:eastAsia="Pretendard" w:hAnsi="Pretendard"/>
+          <w:b/>
+          <w:bCs/>
+          <w:sz w:val="20"/>
+          <w:szCs w:val="20"/>
+        </w:rPr>
+        <w:t>김병준</w:t>
+      </w:r>
+      <w:r>
+        <w:rPr>
+          <w:rFonts w:ascii="Pretendard" w:eastAsia="Pretendard" w:hAnsi="Pretendard"/>
+          <w:sz w:val="20"/>
+          <w:szCs w:val="20"/>
+        </w:rPr>
+        <w:t xml:space="preserve">, </w:t>
+      </w:r>
+      <w:proofErr w:type="spellStart"/>
+      <w:r>
+        <w:rPr>
+          <w:rFonts w:ascii="Pretendard" w:eastAsia="Pretendard" w:hAnsi="Pretendard"/>
+          <w:sz w:val="20"/>
+          <w:szCs w:val="20"/>
+        </w:rPr>
+        <w:t>전봉관</w:t>
+      </w:r>
+      <w:proofErr w:type="spellEnd"/>
+      <w:r>
+        <w:rPr>
+          <w:rFonts w:ascii="Pretendard" w:eastAsia="Pretendard" w:hAnsi="Pretendard"/>
+          <w:sz w:val="20"/>
+          <w:szCs w:val="20"/>
+        </w:rPr>
+        <w:t xml:space="preserve">, </w:t>
+      </w:r>
       <w:proofErr w:type="spellStart"/>
       <w:r>
         <w:rPr>
@@ -4073,43 +4130,7 @@
           <w:sz w:val="20"/>
           <w:szCs w:val="20"/>
         </w:rPr>
-        <w:t xml:space="preserve">, </w:t>
-      </w:r>
-      <w:r>
-        <w:rPr>
-          <w:rFonts w:ascii="Pretendard" w:eastAsia="Pretendard" w:hAnsi="Pretendard"/>
-          <w:b/>
-          <w:bCs/>
-          <w:sz w:val="20"/>
-          <w:szCs w:val="20"/>
-        </w:rPr>
-        <w:t>김병준</w:t>
-      </w:r>
-      <w:r>
-        <w:rPr>
-          <w:rFonts w:ascii="Pretendard" w:eastAsia="Pretendard" w:hAnsi="Pretendard"/>
-          <w:sz w:val="20"/>
-          <w:szCs w:val="20"/>
-        </w:rPr>
-        <w:t xml:space="preserve">, </w:t>
-      </w:r>
-      <w:proofErr w:type="spellStart"/>
-      <w:r>
-        <w:rPr>
-          <w:rFonts w:ascii="Pretendard" w:eastAsia="Pretendard" w:hAnsi="Pretendard"/>
-          <w:sz w:val="20"/>
-          <w:szCs w:val="20"/>
-        </w:rPr>
-        <w:t>전봉관</w:t>
-      </w:r>
-      <w:proofErr w:type="spellEnd"/>
-      <w:r>
-        <w:rPr>
-          <w:rFonts w:ascii="Pretendard" w:eastAsia="Pretendard" w:hAnsi="Pretendard"/>
-          <w:sz w:val="20"/>
-          <w:szCs w:val="20"/>
-        </w:rPr>
-        <w:t xml:space="preserve">. 「작가-비평가 관계와 비평가의 구조적 위치가 소설 단행본 판매량 증감에 미치는 영향: 2010~2015」. </w:t>
+        <w:t xml:space="preserve">. 「비평 언어의 변동: 문예지 비평 텍스트에 나타난 개념단어의 변동 양상, 1995~2015」. </w:t>
       </w:r>
       <w:r>
         <w:rPr>
@@ -4119,6 +4140,124 @@
           <w:sz w:val="20"/>
           <w:szCs w:val="20"/>
         </w:rPr>
+        <w:t>현대문학의 연구</w:t>
+      </w:r>
+      <w:r>
+        <w:rPr>
+          <w:rFonts w:ascii="Pretendard" w:eastAsia="Pretendard" w:hAnsi="Pretendard"/>
+          <w:sz w:val="20"/>
+          <w:szCs w:val="20"/>
+        </w:rPr>
+        <w:t xml:space="preserve">, 61, 2017. </w:t>
+      </w:r>
+      <w:hyperlink r:id="rId43" w:history="1">
+        <w:r>
+          <w:rPr>
+            <w:rStyle w:val="a5"/>
+            <w:rFonts w:ascii="Pretendard" w:eastAsia="Pretendard" w:hAnsi="Pretendard"/>
+            <w:sz w:val="20"/>
+            <w:szCs w:val="20"/>
+          </w:rPr>
+          <w:t>doi.org/10.35419/</w:t>
+        </w:r>
+        <w:proofErr w:type="gramStart"/>
+        <w:r>
+          <w:rPr>
+            <w:rStyle w:val="a5"/>
+            <w:rFonts w:ascii="Pretendard" w:eastAsia="Pretendard" w:hAnsi="Pretendard"/>
+            <w:sz w:val="20"/>
+            <w:szCs w:val="20"/>
+          </w:rPr>
+          <w:t>kmlit.2017..</w:t>
+        </w:r>
+        <w:proofErr w:type="gramEnd"/>
+        <w:r>
+          <w:rPr>
+            <w:rStyle w:val="a5"/>
+            <w:rFonts w:ascii="Pretendard" w:eastAsia="Pretendard" w:hAnsi="Pretendard"/>
+            <w:sz w:val="20"/>
+            <w:szCs w:val="20"/>
+          </w:rPr>
+          <w:t>61.002</w:t>
+        </w:r>
+      </w:hyperlink>
+    </w:p>
+    <w:p>
+      <w:pPr>
+        <w:pStyle w:val="a4"/>
+        <w:numPr>
+          <w:ilvl w:val="0"/>
+          <w:numId w:val="5"/>
+        </w:numPr>
+        <w:spacing w:after="70"/>
+        <w:rPr>
+          <w:rFonts w:ascii="Pretendard" w:eastAsia="Pretendard" w:hAnsi="Pretendard"/>
+          <w:sz w:val="20"/>
+          <w:szCs w:val="20"/>
+        </w:rPr>
+      </w:pPr>
+      <w:proofErr w:type="spellStart"/>
+      <w:r>
+        <w:rPr>
+          <w:rFonts w:ascii="Pretendard" w:eastAsia="Pretendard" w:hAnsi="Pretendard"/>
+          <w:sz w:val="20"/>
+          <w:szCs w:val="20"/>
+        </w:rPr>
+        <w:t>이원재</w:t>
+      </w:r>
+      <w:proofErr w:type="spellEnd"/>
+      <w:r>
+        <w:rPr>
+          <w:rFonts w:ascii="Pretendard" w:eastAsia="Pretendard" w:hAnsi="Pretendard"/>
+          <w:sz w:val="20"/>
+          <w:szCs w:val="20"/>
+        </w:rPr>
+        <w:t xml:space="preserve">, </w:t>
+      </w:r>
+      <w:r>
+        <w:rPr>
+          <w:rFonts w:ascii="Pretendard" w:eastAsia="Pretendard" w:hAnsi="Pretendard"/>
+          <w:b/>
+          <w:bCs/>
+          <w:sz w:val="20"/>
+          <w:szCs w:val="20"/>
+        </w:rPr>
+        <w:t>김병준</w:t>
+      </w:r>
+      <w:r>
+        <w:rPr>
+          <w:rFonts w:ascii="Pretendard" w:eastAsia="Pretendard" w:hAnsi="Pretendard"/>
+          <w:sz w:val="20"/>
+          <w:szCs w:val="20"/>
+        </w:rPr>
+        <w:t xml:space="preserve">, </w:t>
+      </w:r>
+      <w:proofErr w:type="spellStart"/>
+      <w:r>
+        <w:rPr>
+          <w:rFonts w:ascii="Pretendard" w:eastAsia="Pretendard" w:hAnsi="Pretendard"/>
+          <w:sz w:val="20"/>
+          <w:szCs w:val="20"/>
+        </w:rPr>
+        <w:t>전봉관</w:t>
+      </w:r>
+      <w:proofErr w:type="spellEnd"/>
+      <w:r>
+        <w:rPr>
+          <w:rFonts w:ascii="Pretendard" w:eastAsia="Pretendard" w:hAnsi="Pretendard"/>
+          <w:sz w:val="20"/>
+          <w:szCs w:val="20"/>
+        </w:rPr>
+        <w:t xml:space="preserve">. 「작가-비평가 관계와 비평가의 구조적 위치가 소설 단행본 판매량 증감에 미치는 영향: 2010~2015」. </w:t>
+      </w:r>
+      <w:r>
+        <w:rPr>
+          <w:rFonts w:ascii="Pretendard" w:eastAsia="Pretendard" w:hAnsi="Pretendard"/>
+          <w:i/>
+          <w:iCs/>
+          <w:sz w:val="20"/>
+          <w:szCs w:val="20"/>
+        </w:rPr>
         <w:t>한국현대문학연구</w:t>
       </w:r>
       <w:r>
@@ -4129,7 +4268,7 @@
         </w:rPr>
         <w:t xml:space="preserve">, 48, 2016. </w:t>
       </w:r>
-      <w:hyperlink r:id="rId43" w:history="1">
+      <w:hyperlink r:id="rId44" w:history="1">
         <w:r>
           <w:rPr>
             <w:rStyle w:val="a5"/>
@@ -4227,7 +4366,7 @@
         </w:rPr>
         <w:t xml:space="preserve">, 61, 2016. </w:t>
       </w:r>
-      <w:hyperlink r:id="rId44" w:history="1">
+      <w:hyperlink r:id="rId45" w:history="1">
         <w:r>
           <w:rPr>
             <w:rStyle w:val="a5"/>
@@ -4366,7 +4505,7 @@
         </w:rPr>
         <w:t xml:space="preserve">, 48(1): 107–131, 2025. </w:t>
       </w:r>
-      <w:hyperlink r:id="rId45" w:history="1">
+      <w:hyperlink r:id="rId46" w:history="1">
         <w:r>
           <w:rPr>
             <w:rStyle w:val="a5"/>
@@ -4431,7 +4570,7 @@
         </w:rPr>
         <w:t xml:space="preserve">, 74, 2025. </w:t>
       </w:r>
-      <w:hyperlink r:id="rId46" w:history="1">
+      <w:hyperlink r:id="rId47" w:history="1">
         <w:r>
           <w:rPr>
             <w:rStyle w:val="a5"/>
@@ -4439,7 +4578,27 @@
             <w:sz w:val="20"/>
             <w:szCs w:val="20"/>
           </w:rPr>
-          <w:t>doi.org/10.22936/sh.74..202506.016</w:t>
+          <w:t>doi.org/10.22936/sh.</w:t>
+        </w:r>
+        <w:proofErr w:type="gramStart"/>
+        <w:r>
+          <w:rPr>
+            <w:rStyle w:val="a5"/>
+            <w:rFonts w:ascii="Pretendard" w:eastAsia="Pretendard" w:hAnsi="Pretendard"/>
+            <w:sz w:val="20"/>
+            <w:szCs w:val="20"/>
+          </w:rPr>
+          <w:t>74..</w:t>
+        </w:r>
+        <w:proofErr w:type="gramEnd"/>
+        <w:r>
+          <w:rPr>
+            <w:rStyle w:val="a5"/>
+            <w:rFonts w:ascii="Pretendard" w:eastAsia="Pretendard" w:hAnsi="Pretendard"/>
+            <w:sz w:val="20"/>
+            <w:szCs w:val="20"/>
+          </w:rPr>
+          <w:t>202506.016</w:t>
         </w:r>
       </w:hyperlink>
     </w:p>
@@ -4593,7 +4752,7 @@
         </w:rPr>
         <w:t xml:space="preserve">, 2024. </w:t>
       </w:r>
-      <w:hyperlink r:id="rId47" w:history="1">
+      <w:hyperlink r:id="rId48" w:history="1">
         <w:r>
           <w:rPr>
             <w:rStyle w:val="a5"/>
@@ -4692,7 +4851,7 @@
         </w:rPr>
         <w:t xml:space="preserve">, 28, 2021. </w:t>
       </w:r>
-      <w:hyperlink r:id="rId48" w:history="1">
+      <w:hyperlink r:id="rId49" w:history="1">
         <w:r>
           <w:rPr>
             <w:rStyle w:val="a5"/>
@@ -5817,7 +5976,7 @@
         </w:rPr>
         <w:t xml:space="preserve">. </w:t>
       </w:r>
-      <w:hyperlink r:id="rId49" w:history="1">
+      <w:hyperlink r:id="rId50" w:history="1">
         <w:r>
           <w:rPr>
             <w:rStyle w:val="a5"/>
@@ -5906,7 +6065,7 @@
         </w:rPr>
         <w:t xml:space="preserve">. </w:t>
       </w:r>
-      <w:hyperlink r:id="rId50" w:history="1">
+      <w:hyperlink r:id="rId51" w:history="1">
         <w:r>
           <w:rPr>
             <w:rStyle w:val="a5"/>
@@ -6215,7 +6374,25 @@
           <w:sz w:val="20"/>
           <w:szCs w:val="20"/>
         </w:rPr>
-        <w:t xml:space="preserve">“Who Carries the Theory?: A Computational Analysis of Conceptual Travel between Korean and English Literary Studies in South Korea.” Invited article for a special issue of </w:t>
+        <w:t xml:space="preserve">“Who Carries the </w:t>
+      </w:r>
+      <w:proofErr w:type="gramStart"/>
+      <w:r>
+        <w:rPr>
+          <w:rFonts w:ascii="Pretendard" w:eastAsia="Pretendard" w:hAnsi="Pretendard"/>
+          <w:sz w:val="20"/>
+          <w:szCs w:val="20"/>
+        </w:rPr>
+        <w:t>Theory?:</w:t>
+      </w:r>
+      <w:proofErr w:type="gramEnd"/>
+      <w:r>
+        <w:rPr>
+          <w:rFonts w:ascii="Pretendard" w:eastAsia="Pretendard" w:hAnsi="Pretendard"/>
+          <w:sz w:val="20"/>
+          <w:szCs w:val="20"/>
+        </w:rPr>
+        <w:t xml:space="preserve"> A Computational Analysis of Conceptual Travel between Korean and English Literary Studies in South Korea.” Invited article for a special issue of </w:t>
       </w:r>
       <w:r>
         <w:rPr>
@@ -6397,7 +6574,7 @@
         </w:rPr>
         <w:t xml:space="preserve">, Ji, H., Kim, G., Jeong, C., Lee, H., &amp; Park, S. (2026, July). Building a Korean literature TEI/XML database: From data acquisition to AI-enhanced reading [Workshop]. ADHO Digital Humanities Conference (DH2026), Daejeon, South Korea. </w:t>
       </w:r>
-      <w:hyperlink r:id="rId51" w:history="1">
+      <w:hyperlink r:id="rId52" w:history="1">
         <w:r>
           <w:rPr>
             <w:rStyle w:val="a5"/>
@@ -6449,7 +6626,7 @@
         </w:rPr>
         <w:t xml:space="preserve">. 「2008~2024 KCI 데이터로 본 한국문학/한국영문학 담론의 시계열적 비교 분석」. 제3회 한국현대문학자대회, Feb. 2026. </w:t>
       </w:r>
-      <w:hyperlink r:id="rId52" w:history="1">
+      <w:hyperlink r:id="rId53" w:history="1">
         <w:r>
           <w:rPr>
             <w:rStyle w:val="a5"/>
@@ -6501,7 +6678,7 @@
         </w:rPr>
         <w:t xml:space="preserve"> (2026, January). Co-Reading: A human–AI co-reader media system for poetry–emotion–color [Paper presentation]. Hong Kong Association for Digital Humanities Conference (HKADH2026), Hong Kong. </w:t>
       </w:r>
-      <w:hyperlink r:id="rId53" w:history="1">
+      <w:hyperlink r:id="rId54" w:history="1">
         <w:r>
           <w:rPr>
             <w:rStyle w:val="a5"/>
@@ -6579,7 +6756,7 @@
         </w:rPr>
         <w:t xml:space="preserve">]. ADHO Digital Humanities Conference (DH2025), Lisbon, Portugal. </w:t>
       </w:r>
-      <w:hyperlink r:id="rId54" w:history="1">
+      <w:hyperlink r:id="rId55" w:history="1">
         <w:r>
           <w:rPr>
             <w:rStyle w:val="a5"/>
@@ -6819,7 +6996,7 @@
         </w:rPr>
         <w:t xml:space="preserve">Additional conference presentations are listed at </w:t>
       </w:r>
-      <w:hyperlink r:id="rId55" w:history="1">
+      <w:hyperlink r:id="rId56" w:history="1">
         <w:r>
           <w:rPr>
             <w:rStyle w:val="a5"/>
@@ -6840,7 +7017,7 @@
         </w:rPr>
         <w:t xml:space="preserve"> and on </w:t>
       </w:r>
-      <w:hyperlink r:id="rId56" w:history="1">
+      <w:hyperlink r:id="rId57" w:history="1">
         <w:r>
           <w:rPr>
             <w:rStyle w:val="a5"/>
@@ -7830,7 +8007,7 @@
       </w:r>
     </w:p>
     <w:sectPr>
-      <w:footerReference w:type="default" r:id="rId57"/>
+      <w:footerReference w:type="default" r:id="rId58"/>
       <w:pgSz w:w="11906" w:h="16838"/>
       <w:pgMar w:top="1080" w:right="1080" w:bottom="1080" w:left="1080" w:header="708" w:footer="708" w:gutter="0"/>
       <w:cols w:space="720"/>

</xml_diff>